<commit_message>
Fall 1 mit sechs Bildplätzen und Bildprompt-Datei; Serienbibel: längere Fälle ab Fall 2
Co-Authored-By: Claude Opus 5.5 <noreply@anthropic.com>
Claude-Session: https://claude.ai/code/session_01Rqm6WzG9kWnhYjBnATSipi
</commit_message>
<xml_diff>
--- a/krimis/gardinen-01-wollseifen/Mit-Gardinen-ins-Jenseits-Fall-1-Wollseifen.docx
+++ b/krimis/gardinen-01-wollseifen/Mit-Gardinen-ins-Jenseits-Fall-1-Wollseifen.docx
@@ -992,8 +992,44 @@
     </w:p>
     <w:p>
       <w:pPr>
-        <w:spacing w:before="0" w:after="0"/>
-        <w:ind w:firstLine="283"/>
+        <w:spacing w:before="200" w:after="200"/>
+        <w:jc w:val="center"/>
+        <w:pBdr>
+          <w:top w:val="dashed" w:sz="8" w:space="6" w:color="9E9E9E"/>
+          <w:left w:val="dashed" w:sz="8" w:space="6" w:color="9E9E9E"/>
+          <w:bottom w:val="dashed" w:sz="8" w:space="6" w:color="9E9E9E"/>
+          <w:right w:val="dashed" w:sz="8" w:space="6" w:color="9E9E9E"/>
+        </w:pBdr>
+      </w:pPr>
+      <w:r>
+        <w:rPr>
+          <w:b w:val="0"/>
+          <w:i w:val="0"/>
+          <w:color w:val="6B6B6B"/>
+          <w:sz w:val="18"/>
+        </w:rPr>
+        <w:t>Bildplatz 1: Hermine vor der Fahrradwerkstatt</w:t>
+      </w:r>
+      <w:r>
+        <w:br/>
+      </w:r>
+      <w:r>
+        <w:rPr>
+          <w:b w:val="0"/>
+          <w:i w:val="0"/>
+          <w:color w:val="6B6B6B"/>
+          <w:sz w:val="18"/>
+        </w:rPr>
+        <w:t>(Hier das Bild einfügen, Breite 11 cm, dann diesen Kasten löschen.)</w:t>
+        <w:br/>
+        <w:br/>
+        <w:br/>
+        <w:br/>
+      </w:r>
+    </w:p>
+    <w:p>
+      <w:pPr>
+        <w:spacing w:before="0" w:after="0"/>
       </w:pPr>
       <w:r>
         <w:rPr>
@@ -1133,8 +1169,44 @@
     </w:p>
     <w:p>
       <w:pPr>
-        <w:spacing w:before="0" w:after="0"/>
-        <w:ind w:firstLine="283"/>
+        <w:spacing w:before="200" w:after="200"/>
+        <w:jc w:val="center"/>
+        <w:pBdr>
+          <w:top w:val="dashed" w:sz="8" w:space="6" w:color="9E9E9E"/>
+          <w:left w:val="dashed" w:sz="8" w:space="6" w:color="9E9E9E"/>
+          <w:bottom w:val="dashed" w:sz="8" w:space="6" w:color="9E9E9E"/>
+          <w:right w:val="dashed" w:sz="8" w:space="6" w:color="9E9E9E"/>
+        </w:pBdr>
+      </w:pPr>
+      <w:r>
+        <w:rPr>
+          <w:b w:val="0"/>
+          <w:i w:val="0"/>
+          <w:color w:val="6B6B6B"/>
+          <w:sz w:val="18"/>
+        </w:rPr>
+        <w:t>Bildplatz 2: Der Bauer an der Ampel</w:t>
+      </w:r>
+      <w:r>
+        <w:br/>
+      </w:r>
+      <w:r>
+        <w:rPr>
+          <w:b w:val="0"/>
+          <w:i w:val="0"/>
+          <w:color w:val="6B6B6B"/>
+          <w:sz w:val="18"/>
+        </w:rPr>
+        <w:t>(Hier das Bild einfügen, Breite 11 cm, dann diesen Kasten löschen.)</w:t>
+        <w:br/>
+        <w:br/>
+        <w:br/>
+        <w:br/>
+      </w:r>
+    </w:p>
+    <w:p>
+      <w:pPr>
+        <w:spacing w:before="0" w:after="0"/>
       </w:pPr>
       <w:r>
         <w:rPr>
@@ -2882,8 +2954,44 @@
     </w:p>
     <w:p>
       <w:pPr>
-        <w:spacing w:before="0" w:after="0"/>
-        <w:ind w:firstLine="283"/>
+        <w:spacing w:before="200" w:after="200"/>
+        <w:jc w:val="center"/>
+        <w:pBdr>
+          <w:top w:val="dashed" w:sz="8" w:space="6" w:color="9E9E9E"/>
+          <w:left w:val="dashed" w:sz="8" w:space="6" w:color="9E9E9E"/>
+          <w:bottom w:val="dashed" w:sz="8" w:space="6" w:color="9E9E9E"/>
+          <w:right w:val="dashed" w:sz="8" w:space="6" w:color="9E9E9E"/>
+        </w:pBdr>
+      </w:pPr>
+      <w:r>
+        <w:rPr>
+          <w:b w:val="0"/>
+          <w:i w:val="0"/>
+          <w:color w:val="6B6B6B"/>
+          <w:sz w:val="18"/>
+        </w:rPr>
+        <w:t>Bildplatz 3: Die Kirche von Wollseifen im Ginster</w:t>
+      </w:r>
+      <w:r>
+        <w:br/>
+      </w:r>
+      <w:r>
+        <w:rPr>
+          <w:b w:val="0"/>
+          <w:i w:val="0"/>
+          <w:color w:val="6B6B6B"/>
+          <w:sz w:val="18"/>
+        </w:rPr>
+        <w:t>(Hier das Bild einfügen, Breite 11 cm, dann diesen Kasten löschen.)</w:t>
+        <w:br/>
+        <w:br/>
+        <w:br/>
+        <w:br/>
+      </w:r>
+    </w:p>
+    <w:p>
+      <w:pPr>
+        <w:spacing w:before="0" w:after="0"/>
       </w:pPr>
       <w:r>
         <w:rPr>
@@ -3736,8 +3844,44 @@
     </w:p>
     <w:p>
       <w:pPr>
-        <w:spacing w:before="0" w:after="0"/>
-        <w:ind w:firstLine="283"/>
+        <w:spacing w:before="200" w:after="200"/>
+        <w:jc w:val="center"/>
+        <w:pBdr>
+          <w:top w:val="dashed" w:sz="8" w:space="6" w:color="9E9E9E"/>
+          <w:left w:val="dashed" w:sz="8" w:space="6" w:color="9E9E9E"/>
+          <w:bottom w:val="dashed" w:sz="8" w:space="6" w:color="9E9E9E"/>
+          <w:right w:val="dashed" w:sz="8" w:space="6" w:color="9E9E9E"/>
+        </w:pBdr>
+      </w:pPr>
+      <w:r>
+        <w:rPr>
+          <w:b w:val="0"/>
+          <w:i w:val="0"/>
+          <w:color w:val="6B6B6B"/>
+          <w:sz w:val="18"/>
+        </w:rPr>
+        <w:t>Bildplatz 4: Josefine und Konrad</w:t>
+      </w:r>
+      <w:r>
+        <w:br/>
+      </w:r>
+      <w:r>
+        <w:rPr>
+          <w:b w:val="0"/>
+          <w:i w:val="0"/>
+          <w:color w:val="6B6B6B"/>
+          <w:sz w:val="18"/>
+        </w:rPr>
+        <w:t>(Hier das Bild einfügen, Breite 11 cm, dann diesen Kasten löschen.)</w:t>
+        <w:br/>
+        <w:br/>
+        <w:br/>
+        <w:br/>
+      </w:r>
+    </w:p>
+    <w:p>
+      <w:pPr>
+        <w:spacing w:before="0" w:after="0"/>
       </w:pPr>
       <w:r>
         <w:rPr>
@@ -5406,8 +5550,44 @@
     </w:p>
     <w:p>
       <w:pPr>
-        <w:spacing w:before="0" w:after="0"/>
-        <w:ind w:firstLine="283"/>
+        <w:spacing w:before="200" w:after="200"/>
+        <w:jc w:val="center"/>
+        <w:pBdr>
+          <w:top w:val="dashed" w:sz="8" w:space="6" w:color="9E9E9E"/>
+          <w:left w:val="dashed" w:sz="8" w:space="6" w:color="9E9E9E"/>
+          <w:bottom w:val="dashed" w:sz="8" w:space="6" w:color="9E9E9E"/>
+          <w:right w:val="dashed" w:sz="8" w:space="6" w:color="9E9E9E"/>
+        </w:pBdr>
+      </w:pPr>
+      <w:r>
+        <w:rPr>
+          <w:b w:val="0"/>
+          <w:i w:val="0"/>
+          <w:color w:val="6B6B6B"/>
+          <w:sz w:val="18"/>
+        </w:rPr>
+        <w:t>Bildplatz 5: Nachtwanderung über die Hochfläche</w:t>
+      </w:r>
+      <w:r>
+        <w:br/>
+      </w:r>
+      <w:r>
+        <w:rPr>
+          <w:b w:val="0"/>
+          <w:i w:val="0"/>
+          <w:color w:val="6B6B6B"/>
+          <w:sz w:val="18"/>
+        </w:rPr>
+        <w:t>(Hier das Bild einfügen, Breite 11 cm, dann diesen Kasten löschen.)</w:t>
+        <w:br/>
+        <w:br/>
+        <w:br/>
+        <w:br/>
+      </w:r>
+    </w:p>
+    <w:p>
+      <w:pPr>
+        <w:spacing w:before="0" w:after="0"/>
       </w:pPr>
       <w:r>
         <w:rPr>
@@ -6712,8 +6892,44 @@
     </w:p>
     <w:p>
       <w:pPr>
-        <w:spacing w:before="0" w:after="0"/>
-        <w:ind w:firstLine="283"/>
+        <w:spacing w:before="200" w:after="200"/>
+        <w:jc w:val="center"/>
+        <w:pBdr>
+          <w:top w:val="dashed" w:sz="8" w:space="6" w:color="9E9E9E"/>
+          <w:left w:val="dashed" w:sz="8" w:space="6" w:color="9E9E9E"/>
+          <w:bottom w:val="dashed" w:sz="8" w:space="6" w:color="9E9E9E"/>
+          <w:right w:val="dashed" w:sz="8" w:space="6" w:color="9E9E9E"/>
+        </w:pBdr>
+      </w:pPr>
+      <w:r>
+        <w:rPr>
+          <w:b w:val="0"/>
+          <w:i w:val="0"/>
+          <w:color w:val="6B6B6B"/>
+          <w:sz w:val="18"/>
+        </w:rPr>
+        <w:t>Bildplatz 6: Der Messingring in der Kirche</w:t>
+      </w:r>
+      <w:r>
+        <w:br/>
+      </w:r>
+      <w:r>
+        <w:rPr>
+          <w:b w:val="0"/>
+          <w:i w:val="0"/>
+          <w:color w:val="6B6B6B"/>
+          <w:sz w:val="18"/>
+        </w:rPr>
+        <w:t>(Hier das Bild einfügen, Breite 11 cm, dann diesen Kasten löschen.)</w:t>
+        <w:br/>
+        <w:br/>
+        <w:br/>
+        <w:br/>
+      </w:r>
+    </w:p>
+    <w:p>
+      <w:pPr>
+        <w:spacing w:before="0" w:after="0"/>
       </w:pPr>
       <w:r>
         <w:rPr>

</xml_diff>